<commit_message>
Refactor RuleEngine und RuleLoader (Version 0.4.0-alpha)
</commit_message>
<xml_diff>
--- a/examples/test.docx
+++ b/examples/test.docx
@@ -7,7 +7,11 @@
         <w:t>Hallo Welt!</w:t>
       </w:r>
     </w:p>
-    <w:p/>
+    <w:p>
+      <w:r>
+        <w:t>Test 123</w:t>
+      </w:r>
+    </w:p>
     <w:p>
       <w:r>
         <w:t>Dies ist unser erster Test.</w:t>
@@ -24,7 +28,30 @@
         <w:t xml:space="preserve"> e</w:t>
       </w:r>
     </w:p>
-    <w:p/>
+    <w:p>
+      <w:proofErr w:type="spellStart"/>
+      <w:proofErr w:type="gramStart"/>
+      <w:r>
+        <w:t>Stra</w:t>
+      </w:r>
+      <w:proofErr w:type="spellEnd"/>
+      <w:r>
+        <w:t xml:space="preserve">  e</w:t>
+      </w:r>
+      <w:proofErr w:type="gramEnd"/>
+    </w:p>
+    <w:p>
+      <w:proofErr w:type="spellStart"/>
+      <w:r>
+        <w:t>Stra</w:t>
+      </w:r>
+      <w:proofErr w:type="spellEnd"/>
+      <w:r>
+        <w:t xml:space="preserve">   e</w:t>
+      </w:r>
+      <w:bookmarkStart w:id="0" w:name="_GoBack"/>
+      <w:bookmarkEnd w:id="0"/>
+    </w:p>
     <w:p>
       <w:proofErr w:type="spellStart"/>
       <w:r>
@@ -55,8 +82,6 @@
       <w:r>
         <w:t>ffentlicht</w:t>
       </w:r>
-      <w:bookmarkStart w:id="0" w:name="_GoBack"/>
-      <w:bookmarkEnd w:id="0"/>
       <w:proofErr w:type="spellEnd"/>
     </w:p>
     <w:sectPr>

</xml_diff>